<commit_message>
Banco, fatia 5 no app: o cronograma da página oficial com o Supabase
Espelho lê etapas, avanços, linhas de base, publicações e modelos; as ações do escritório
(etapas, modelo, % à mão, linha de base, publicar) vão ao banco (js/cronograma-oficial.js);
a construtora recebe as publicações; o aviso da aprovação diz quantas etapas receberam
andamento. Teste de ponta a ponta tests/cronograma-oficial.test.mjs (local 30/30); Início da
conta, roteiro, portal e docs atualizados.

Co-Authored-By: Claude Fable 5.1 <noreply@anthropic.com>
Claude-Session: https://claude.ai/code/session_01Ep8bJsuQq2bqGePCMzzux2
</commit_message>
<xml_diff>
--- a/portal/files/KORbuild Daily - Prototype status.docx
+++ b/portal/files/KORbuild Daily - Prototype status.docx
@@ -279,6 +279,40 @@
                 <w:sz w:val="18"/>
               </w:rPr>
               <w:t>Opens anywhere, no sign-in, with the photos by temporary links; the database checks the seal on every open.</w:t>
+            </w:r>
+          </w:p>
+        </w:tc>
+      </w:tr>
+      <w:tr>
+        <w:tc>
+          <w:tcPr>
+            <w:tcW w:type="dxa" w:w="4873"/>
+          </w:tcPr>
+          <w:p>
+            <w:r/>
+            <w:r>
+              <w:rPr>
+                <w:b w:val="0"/>
+                <w:i w:val="0"/>
+                <w:sz w:val="18"/>
+              </w:rPr>
+              <w:t>Job schedule</w:t>
+            </w:r>
+          </w:p>
+        </w:tc>
+        <w:tc>
+          <w:tcPr>
+            <w:tcW w:type="dxa" w:w="4873"/>
+          </w:tcPr>
+          <w:p>
+            <w:r/>
+            <w:r>
+              <w:rPr>
+                <w:b w:val="0"/>
+                <w:i w:val="0"/>
+                <w:sz w:val="18"/>
+              </w:rPr>
+              <w:t>Stages with start and end, baseline, percent complete from the approved report (or by hand, with history) and publication to the general contractor by version. A stage that already received progress from an approved report cannot be deleted, and only the person who approved can change it.</w:t>
             </w:r>
           </w:p>
         </w:tc>

</xml_diff>